<commit_message>
Update evaluation kịch bản 400 câu và tối ưu bảo mật
</commit_message>
<xml_diff>
--- a/data_store/word/Cách giặt tã vải cho trẻ nhỏ.docx
+++ b/data_store/word/Cách giặt tã vải cho trẻ nhỏ.docx
@@ -135,61 +135,7 @@
         <w:t>.</w:t>
       </w:r>
     </w:p>
-    <w:p>
-      <w:r>
-        <w:rPr>
-          <w:noProof/>
-        </w:rPr>
-        <w:drawing>
-          <wp:inline distT="0" distB="0" distL="0" distR="0">
-            <wp:extent cx="4763135" cy="3183890"/>
-            <wp:effectExtent l="0" t="0" r="0" b="0"/>
-            <wp:docPr id="4" name="Picture 4" descr="&#10;Việc ngâm tã lâu kèm với baking soda có thể khiến vi khuẩn phát triển&#10;"/>
-            <wp:cNvGraphicFramePr>
-              <a:graphicFrameLocks xmlns:a="http://schemas.openxmlformats.org/drawingml/2006/main" noChangeAspect="1"/>
-            </wp:cNvGraphicFramePr>
-            <a:graphic xmlns:a="http://schemas.openxmlformats.org/drawingml/2006/main">
-              <a:graphicData uri="http://schemas.openxmlformats.org/drawingml/2006/picture">
-                <pic:pic xmlns:pic="http://schemas.openxmlformats.org/drawingml/2006/picture">
-                  <pic:nvPicPr>
-                    <pic:cNvPr id="0" name="Picture 1" descr="&#10;Việc ngâm tã lâu kèm với baking soda có thể khiến vi khuẩn phát triển&#10;"/>
-                    <pic:cNvPicPr>
-                      <a:picLocks noChangeAspect="1" noChangeArrowheads="1"/>
-                    </pic:cNvPicPr>
-                  </pic:nvPicPr>
-                  <pic:blipFill>
-                    <a:blip r:embed="rId7">
-                      <a:extLst>
-                        <a:ext uri="{28A0092B-C50C-407E-A947-70E740481C1C}">
-                          <a14:useLocalDpi xmlns:a14="http://schemas.microsoft.com/office/drawing/2010/main" val="0"/>
-                        </a:ext>
-                      </a:extLst>
-                    </a:blip>
-                    <a:srcRect/>
-                    <a:stretch>
-                      <a:fillRect/>
-                    </a:stretch>
-                  </pic:blipFill>
-                  <pic:spPr bwMode="auto">
-                    <a:xfrm>
-                      <a:off x="0" y="0"/>
-                      <a:ext cx="4763135" cy="3183890"/>
-                    </a:xfrm>
-                    <a:prstGeom prst="rect">
-                      <a:avLst/>
-                    </a:prstGeom>
-                    <a:noFill/>
-                    <a:ln>
-                      <a:noFill/>
-                    </a:ln>
-                  </pic:spPr>
-                </pic:pic>
-              </a:graphicData>
-            </a:graphic>
-          </wp:inline>
-        </w:drawing>
-      </w:r>
-    </w:p>
+    <w:p/>
     <w:p>
       <w:r>
         <w:t xml:space="preserve">Việc ngâm tã lâu kèm với baking soda có thể khiến vi khuẩn phát triển </w:t>
@@ -200,7 +146,6 @@
         <w:pStyle w:val="Heading2"/>
       </w:pPr>
       <w:r>
-        <w:lastRenderedPageBreak/>
         <w:t>2. Sản phẩm nên và không nên sử dụng</w:t>
       </w:r>
     </w:p>
@@ -219,7 +164,7 @@
       <w:r>
         <w:t xml:space="preserve">Đôi khi, bạn cần sử dụng thuốc tẩy để khử trùng nếu bé bị </w:t>
       </w:r>
-      <w:hyperlink r:id="rId8" w:history="1">
+      <w:hyperlink r:id="rId7" w:history="1">
         <w:r>
           <w:rPr>
             <w:rStyle w:val="Hyperlink"/>
@@ -232,7 +177,7 @@
       <w:r>
         <w:t xml:space="preserve"> hoặc </w:t>
       </w:r>
-      <w:hyperlink r:id="rId9" w:history="1">
+      <w:hyperlink r:id="rId8" w:history="1">
         <w:r>
           <w:rPr>
             <w:rStyle w:val="Hyperlink"/>
@@ -253,7 +198,7 @@
       <w:r>
         <w:t xml:space="preserve">Để loại bỏ mùi hôi, một số người thích thêm khoảng nửa cốc baking soda hoặc một cốc </w:t>
       </w:r>
-      <w:hyperlink r:id="rId10" w:history="1">
+      <w:hyperlink r:id="rId9" w:history="1">
         <w:r>
           <w:rPr>
             <w:rStyle w:val="Hyperlink"/>
@@ -290,6 +235,7 @@
         <w:pStyle w:val="Heading2"/>
       </w:pPr>
       <w:r>
+        <w:lastRenderedPageBreak/>
         <w:t>3. Các bước giặt tã vải</w:t>
       </w:r>
     </w:p>
@@ -337,62 +283,7 @@
         <w:t>Cần đảm bảo xả sạch vết bẩn và chất tẩy rửa trong tã. Nước giặt cuối cùng phải hoàn toàn không còn xà phòng. Nếu không, bạn cần giặt lại tã thêm lần nữa. Khi lấy ra khỏi máy giặt, tã phải có mùi mới và sạch sẽ. Nếu vẫn còn mùi tã bẩn, dù chỉ thoang thoảng, bạn vẫn nên giặt lại. Mùi hôi bám lại có nghĩa là tã còn chứa vi khuẩn, có thể gây kích ứng da của bé hoặc hăm tã.</w:t>
       </w:r>
     </w:p>
-    <w:p>
-      <w:r>
-        <w:rPr>
-          <w:noProof/>
-        </w:rPr>
-        <w:lastRenderedPageBreak/>
-        <w:drawing>
-          <wp:inline distT="0" distB="0" distL="0" distR="0">
-            <wp:extent cx="3433445" cy="3433445"/>
-            <wp:effectExtent l="0" t="0" r="0" b="0"/>
-            <wp:docPr id="3" name="Picture 3" descr="&#10;Ba mẹ cần đảm bảo tã vải phải được giặt sạch sẽ&#10;"/>
-            <wp:cNvGraphicFramePr>
-              <a:graphicFrameLocks xmlns:a="http://schemas.openxmlformats.org/drawingml/2006/main" noChangeAspect="1"/>
-            </wp:cNvGraphicFramePr>
-            <a:graphic xmlns:a="http://schemas.openxmlformats.org/drawingml/2006/main">
-              <a:graphicData uri="http://schemas.openxmlformats.org/drawingml/2006/picture">
-                <pic:pic xmlns:pic="http://schemas.openxmlformats.org/drawingml/2006/picture">
-                  <pic:nvPicPr>
-                    <pic:cNvPr id="0" name="Picture 2" descr="&#10;Ba mẹ cần đảm bảo tã vải phải được giặt sạch sẽ&#10;"/>
-                    <pic:cNvPicPr>
-                      <a:picLocks noChangeAspect="1" noChangeArrowheads="1"/>
-                    </pic:cNvPicPr>
-                  </pic:nvPicPr>
-                  <pic:blipFill>
-                    <a:blip r:embed="rId11">
-                      <a:extLst>
-                        <a:ext uri="{28A0092B-C50C-407E-A947-70E740481C1C}">
-                          <a14:useLocalDpi xmlns:a14="http://schemas.microsoft.com/office/drawing/2010/main" val="0"/>
-                        </a:ext>
-                      </a:extLst>
-                    </a:blip>
-                    <a:srcRect/>
-                    <a:stretch>
-                      <a:fillRect/>
-                    </a:stretch>
-                  </pic:blipFill>
-                  <pic:spPr bwMode="auto">
-                    <a:xfrm>
-                      <a:off x="0" y="0"/>
-                      <a:ext cx="3433445" cy="3433445"/>
-                    </a:xfrm>
-                    <a:prstGeom prst="rect">
-                      <a:avLst/>
-                    </a:prstGeom>
-                    <a:noFill/>
-                    <a:ln>
-                      <a:noFill/>
-                    </a:ln>
-                  </pic:spPr>
-                </pic:pic>
-              </a:graphicData>
-            </a:graphic>
-          </wp:inline>
-        </w:drawing>
-      </w:r>
-    </w:p>
+    <w:p/>
     <w:p>
       <w:r>
         <w:t xml:space="preserve">Ba mẹ cần đảm bảo tã vải phải được giặt sạch sẽ </w:t>
@@ -422,62 +313,7 @@
         <w:t>Phơi dưới ánh nắng mặt trời có thể giúp tã vải nhanh khô và trắng hơn, nhưng nắng quá gắt có thể khiến tã hơi cứng. Nếu gặp tình trạng này, bạn có thể cho tã vào máy sấy trong vài phút để làm mềm vải. Nên phơi tã ở nơi thoáng gió, vào sáng sớm hoặc chiều muộn, hoặc phơi trong nhà để giúp tã mau khô và mềm hơn.</w:t>
       </w:r>
     </w:p>
-    <w:p>
-      <w:r>
-        <w:rPr>
-          <w:noProof/>
-        </w:rPr>
-        <w:lastRenderedPageBreak/>
-        <w:drawing>
-          <wp:inline distT="0" distB="0" distL="0" distR="0">
-            <wp:extent cx="4763135" cy="3574415"/>
-            <wp:effectExtent l="0" t="0" r="0" b="6985"/>
-            <wp:docPr id="2" name="Picture 2" descr="&#10;Phơi tã vải dưới ánh nắng mặt trời giúp tã nhanh khô hơn&#10;"/>
-            <wp:cNvGraphicFramePr>
-              <a:graphicFrameLocks xmlns:a="http://schemas.openxmlformats.org/drawingml/2006/main" noChangeAspect="1"/>
-            </wp:cNvGraphicFramePr>
-            <a:graphic xmlns:a="http://schemas.openxmlformats.org/drawingml/2006/main">
-              <a:graphicData uri="http://schemas.openxmlformats.org/drawingml/2006/picture">
-                <pic:pic xmlns:pic="http://schemas.openxmlformats.org/drawingml/2006/picture">
-                  <pic:nvPicPr>
-                    <pic:cNvPr id="0" name="Picture 3" descr="&#10;Phơi tã vải dưới ánh nắng mặt trời giúp tã nhanh khô hơn&#10;"/>
-                    <pic:cNvPicPr>
-                      <a:picLocks noChangeAspect="1" noChangeArrowheads="1"/>
-                    </pic:cNvPicPr>
-                  </pic:nvPicPr>
-                  <pic:blipFill>
-                    <a:blip r:embed="rId12">
-                      <a:extLst>
-                        <a:ext uri="{28A0092B-C50C-407E-A947-70E740481C1C}">
-                          <a14:useLocalDpi xmlns:a14="http://schemas.microsoft.com/office/drawing/2010/main" val="0"/>
-                        </a:ext>
-                      </a:extLst>
-                    </a:blip>
-                    <a:srcRect/>
-                    <a:stretch>
-                      <a:fillRect/>
-                    </a:stretch>
-                  </pic:blipFill>
-                  <pic:spPr bwMode="auto">
-                    <a:xfrm>
-                      <a:off x="0" y="0"/>
-                      <a:ext cx="4763135" cy="3574415"/>
-                    </a:xfrm>
-                    <a:prstGeom prst="rect">
-                      <a:avLst/>
-                    </a:prstGeom>
-                    <a:noFill/>
-                    <a:ln>
-                      <a:noFill/>
-                    </a:ln>
-                  </pic:spPr>
-                </pic:pic>
-              </a:graphicData>
-            </a:graphic>
-          </wp:inline>
-        </w:drawing>
-      </w:r>
-    </w:p>
+    <w:p/>
     <w:p>
       <w:r>
         <w:t xml:space="preserve">Phơi tã vải dưới ánh nắng mặt trời giúp tã nhanh khô hơn </w:t>
@@ -495,6 +331,7 @@
       <w:pPr>
         <w:pStyle w:val="NormalWeb"/>
       </w:pPr>
+      <w:bookmarkStart w:id="0" w:name="_GoBack"/>
       <w:r>
         <w:t xml:space="preserve">Mặc dù mỗi người sẽ có một lịch trình giặt giũ riêng phù hợp với hoàn cảnh cá nhân, nhưng hầu hết các gia đình đồng ý nên </w:t>
       </w:r>
@@ -546,6 +383,7 @@
         <w:spacing w:before="100" w:beforeAutospacing="1" w:after="100" w:afterAutospacing="1" w:line="240" w:lineRule="auto"/>
       </w:pPr>
       <w:r>
+        <w:lastRenderedPageBreak/>
         <w:t>Trẻ sơ sinh: Thay 12 - 18 tã mỗi ngày, cách ngày giặt 1 - 2 lần.</w:t>
       </w:r>
     </w:p>
@@ -626,7 +464,7 @@
       <w:r>
         <w:t xml:space="preserve"> cho bé phức tạp hơn so với </w:t>
       </w:r>
-      <w:hyperlink r:id="rId13" w:history="1">
+      <w:hyperlink r:id="rId10" w:history="1">
         <w:r>
           <w:rPr>
             <w:rStyle w:val="Hyperlink"/>
@@ -640,62 +478,8 @@
         <w:t>.</w:t>
       </w:r>
     </w:p>
-    <w:p>
-      <w:r>
-        <w:rPr>
-          <w:noProof/>
-        </w:rPr>
-        <w:lastRenderedPageBreak/>
-        <w:drawing>
-          <wp:inline distT="0" distB="0" distL="0" distR="0">
-            <wp:extent cx="4763135" cy="4763135"/>
-            <wp:effectExtent l="0" t="0" r="0" b="0"/>
-            <wp:docPr id="1" name="Picture 1" descr="&#10;Tã vải giúp ba mẹ tiết kiệm thời gian chăm sóc bé&#10;"/>
-            <wp:cNvGraphicFramePr>
-              <a:graphicFrameLocks xmlns:a="http://schemas.openxmlformats.org/drawingml/2006/main" noChangeAspect="1"/>
-            </wp:cNvGraphicFramePr>
-            <a:graphic xmlns:a="http://schemas.openxmlformats.org/drawingml/2006/main">
-              <a:graphicData uri="http://schemas.openxmlformats.org/drawingml/2006/picture">
-                <pic:pic xmlns:pic="http://schemas.openxmlformats.org/drawingml/2006/picture">
-                  <pic:nvPicPr>
-                    <pic:cNvPr id="0" name="Picture 4" descr="&#10;Tã vải giúp ba mẹ tiết kiệm thời gian chăm sóc bé&#10;"/>
-                    <pic:cNvPicPr>
-                      <a:picLocks noChangeAspect="1" noChangeArrowheads="1"/>
-                    </pic:cNvPicPr>
-                  </pic:nvPicPr>
-                  <pic:blipFill>
-                    <a:blip r:embed="rId14">
-                      <a:extLst>
-                        <a:ext uri="{28A0092B-C50C-407E-A947-70E740481C1C}">
-                          <a14:useLocalDpi xmlns:a14="http://schemas.microsoft.com/office/drawing/2010/main" val="0"/>
-                        </a:ext>
-                      </a:extLst>
-                    </a:blip>
-                    <a:srcRect/>
-                    <a:stretch>
-                      <a:fillRect/>
-                    </a:stretch>
-                  </pic:blipFill>
-                  <pic:spPr bwMode="auto">
-                    <a:xfrm>
-                      <a:off x="0" y="0"/>
-                      <a:ext cx="4763135" cy="4763135"/>
-                    </a:xfrm>
-                    <a:prstGeom prst="rect">
-                      <a:avLst/>
-                    </a:prstGeom>
-                    <a:noFill/>
-                    <a:ln>
-                      <a:noFill/>
-                    </a:ln>
-                  </pic:spPr>
-                </pic:pic>
-              </a:graphicData>
-            </a:graphic>
-          </wp:inline>
-        </w:drawing>
-      </w:r>
-    </w:p>
+    <w:bookmarkEnd w:id="0"/>
+    <w:p/>
     <w:p>
       <w:r>
         <w:t xml:space="preserve">Tã vải giúp ba mẹ tiết kiệm thời gian chăm sóc bé </w:t>
@@ -720,7 +504,7 @@
       <w:r>
         <w:t xml:space="preserve">Để đặt lịch khám tại viện, Quý khách vui lòng bấm số </w:t>
       </w:r>
-      <w:hyperlink r:id="rId15" w:anchor="modal-call-button')" w:history="1">
+      <w:hyperlink r:id="rId11" w:anchor="modal-call-button')" w:history="1">
         <w:r>
           <w:rPr>
             <w:rStyle w:val="Hyperlink"/>
@@ -731,7 +515,7 @@
       <w:r>
         <w:t xml:space="preserve"> hoặc đặt lịch trực tiếp </w:t>
       </w:r>
-      <w:hyperlink r:id="rId16" w:tgtFrame="_blank" w:history="1">
+      <w:hyperlink r:id="rId12" w:tgtFrame="_blank" w:history="1">
         <w:r>
           <w:rPr>
             <w:rStyle w:val="Hyperlink"/>
@@ -742,7 +526,7 @@
       <w:r>
         <w:t xml:space="preserve">. Tải và đặt lịch khám tự động trên ứng dụng </w:t>
       </w:r>
-      <w:hyperlink r:id="rId17" w:tgtFrame="_blank" w:history="1">
+      <w:hyperlink r:id="rId13" w:tgtFrame="_blank" w:history="1">
         <w:r>
           <w:rPr>
             <w:rStyle w:val="Hyperlink"/>
@@ -754,10 +538,7 @@
         <w:t xml:space="preserve"> để quản lý, theo dõi lịch và đặt hẹn mọi lúc mọi nơi ngay trên ứng dụng.</w:t>
       </w:r>
     </w:p>
-    <w:p>
-      <w:bookmarkStart w:id="0" w:name="_GoBack"/>
-      <w:bookmarkEnd w:id="0"/>
-    </w:p>
+    <w:p/>
     <w:sectPr>
       <w:pgSz w:w="12240" w:h="15840"/>
       <w:pgMar w:top="1440" w:right="1440" w:bottom="1440" w:left="1440" w:header="720" w:footer="720" w:gutter="0"/>

</xml_diff>